<commit_message>
Lab 2: replace flats.csv with Advertising.csv dataset, fix regression plot and report
</commit_message>
<xml_diff>
--- a/Lab_2/report/ІАД_КН-2327Б_Багрій-Белз_ЛР-2.docx
+++ b/Lab_2/report/ІАД_КН-2327Б_Багрій-Белз_ЛР-2.docx
@@ -743,7 +743,7 @@
           <w:sz w:val="28"/>
           <w:rFonts w:ascii="Times New Roman" w:hAnsi="Times New Roman" w:cs="Times New Roman" w:eastAsia="Times New Roman"/>
         </w:rPr>
-        <w:t>Дослідження залежності між площею квартири та її ціною на власному числовому наборі даних flats.csv.</w:t>
+        <w:t>Дослідження залежності між витратами на TV-рекламу та обсягом продажів продукції на власному наборі даних Advertising.csv.</w:t>
       </w:r>
     </w:p>
     <w:p>
@@ -761,7 +761,7 @@
           <w:sz w:val="28"/>
           <w:rFonts w:ascii="Times New Roman" w:hAnsi="Times New Roman" w:cs="Times New Roman" w:eastAsia="Times New Roman"/>
         </w:rPr>
-        <w:t>Для аналізу використано набір даних вторинного ринку нерухомості flats.csv (684 спостереження після очищення некоректних даних та викидів). Досліджено залежність між загальною площею квартири (незалежна змінна X, м²) та її вартістю (залежна змінна Y, грн).</w:t>
+        <w:t>Для дослідження використано класичний економічний набір даних Advertising.csv (200 спостережень). Досліджено парну лінійну залежність між інвестиціями в телевізійну рекламу (незалежна змінна X, тис. дол.) та обсягом продажів продукції (залежна змінна Y, тис. одиниць товару).</w:t>
       </w:r>
     </w:p>
     <w:p>
@@ -779,7 +779,7 @@
           <w:sz w:val="28"/>
           <w:rFonts w:ascii="Times New Roman" w:hAnsi="Times New Roman" w:cs="Times New Roman" w:eastAsia="Times New Roman"/>
         </w:rPr>
-        <w:t>Парна регресія та кореляційний аналіз для ринку житла:</w:t>
+        <w:t>Парна регресія та кореляційний аналіз ефективності реклами:</w:t>
       </w:r>
     </w:p>
     <w:p>
@@ -839,7 +839,7 @@
           <w:sz w:val="28"/>
           <w:rFonts w:ascii="Times New Roman" w:hAnsi="Times New Roman" w:cs="Times New Roman" w:eastAsia="Times New Roman"/>
         </w:rPr>
-        <w:t xml:space="preserve">Коефіцієнт кореляції Пірсона між площею та ціною становить </w:t>
+        <w:t xml:space="preserve">Коефіцієнт кореляції Пірсона між витратами на TV-рекламу та продажами становить </w:t>
       </w:r>
       <w:r>
         <w:rPr>
@@ -849,7 +849,7 @@
           <w:sz w:val="28"/>
           <w:rFonts w:ascii="Times New Roman" w:hAnsi="Times New Roman" w:cs="Times New Roman" w:eastAsia="Times New Roman"/>
         </w:rPr>
-        <w:t>r = 0.6729</w:t>
+        <w:t>r = 0.7822</w:t>
       </w:r>
       <w:r>
         <w:rPr>
@@ -869,7 +869,7 @@
           <w:sz w:val="28"/>
           <w:rFonts w:ascii="Times New Roman" w:hAnsi="Times New Roman" w:cs="Times New Roman" w:eastAsia="Times New Roman"/>
         </w:rPr>
-        <w:t>2.41e-91</w:t>
+        <w:t>1.47e-42</w:t>
       </w:r>
       <w:r>
         <w:rPr>
@@ -879,7 +879,7 @@
           <w:sz w:val="28"/>
           <w:rFonts w:ascii="Times New Roman" w:hAnsi="Times New Roman" w:cs="Times New Roman" w:eastAsia="Times New Roman"/>
         </w:rPr>
-        <w:t>, що свідчить про помітний стійкий позитивний зв'язок зі стовідсотковою статистичною значущістю.</w:t>
+        <w:t>, що вказує на сильний стійкий прямий лінійний зв'язок зі стовідсотковою статистичною достовірністю.</w:t>
       </w:r>
     </w:p>
     <w:p>
@@ -915,7 +915,7 @@
           <w:sz w:val="28"/>
           <w:rFonts w:ascii="Times New Roman" w:hAnsi="Times New Roman" w:cs="Times New Roman" w:eastAsia="Times New Roman"/>
         </w:rPr>
-        <w:t>Ціна</w:t>
+        <w:t>Sales</w:t>
       </w:r>
       <w:r>
         <w:rPr>
@@ -925,7 +925,7 @@
           <w:sz w:val="28"/>
           <w:rFonts w:ascii="Times New Roman" w:hAnsi="Times New Roman" w:cs="Times New Roman" w:eastAsia="Times New Roman"/>
         </w:rPr>
-        <w:t xml:space="preserve"> = 25180.99 · </w:t>
+        <w:t xml:space="preserve"> = 0.0475 · </w:t>
       </w:r>
       <w:r>
         <w:rPr>
@@ -935,7 +935,7 @@
           <w:sz w:val="28"/>
           <w:rFonts w:ascii="Times New Roman" w:hAnsi="Times New Roman" w:cs="Times New Roman" w:eastAsia="Times New Roman"/>
         </w:rPr>
-        <w:t>Площа</w:t>
+        <w:t>TV</w:t>
       </w:r>
       <w:r>
         <w:rPr>
@@ -945,7 +945,7 @@
           <w:sz w:val="28"/>
           <w:rFonts w:ascii="Times New Roman" w:hAnsi="Times New Roman" w:cs="Times New Roman" w:eastAsia="Times New Roman"/>
         </w:rPr>
-        <w:t xml:space="preserve"> − 408119.63</w:t>
+        <w:t xml:space="preserve"> + 7.03</w:t>
       </w:r>
     </w:p>
     <w:p>
@@ -963,7 +963,7 @@
           <w:sz w:val="28"/>
           <w:rFonts w:ascii="Times New Roman" w:hAnsi="Times New Roman" w:cs="Times New Roman" w:eastAsia="Times New Roman"/>
         </w:rPr>
-        <w:t xml:space="preserve">де кутовий коефіцієнт a = 25180.99 грн/м² інтерпретується як гранична середня ціна одного додаткового квадратного метра житла. Коефіцієнт детермінації становить </w:t>
+        <w:t xml:space="preserve">де кутовий коефіцієнт a = 0.0475 вказує, що кожна додаткова 1 000 доларів, витрачена на TV-рекламу, забезпечує приріст продажів у середньому на 47.5 одиниць товару, а базовий обсяг продажів без реклами становить b = 7.03 тис. одиниць. Коефіцієнт детермінації становить </w:t>
       </w:r>
       <w:r>
         <w:rPr>
@@ -973,7 +973,7 @@
           <w:sz w:val="28"/>
           <w:rFonts w:ascii="Times New Roman" w:hAnsi="Times New Roman" w:cs="Times New Roman" w:eastAsia="Times New Roman"/>
         </w:rPr>
-        <w:t>R² = 0.4527</w:t>
+        <w:t>R² = 0.6119</w:t>
       </w:r>
       <w:r>
         <w:rPr>
@@ -993,7 +993,7 @@
           <w:sz w:val="28"/>
           <w:rFonts w:ascii="Times New Roman" w:hAnsi="Times New Roman" w:cs="Times New Roman" w:eastAsia="Times New Roman"/>
         </w:rPr>
-        <w:t>801 528.39 грн</w:t>
+        <w:t>3.24 тис. од.</w:t>
       </w:r>
       <w:r>
         <w:rPr>
@@ -1003,7 +1003,7 @@
           <w:sz w:val="28"/>
           <w:rFonts w:ascii="Times New Roman" w:hAnsi="Times New Roman" w:cs="Times New Roman" w:eastAsia="Times New Roman"/>
         </w:rPr>
-        <w:t>. Це демонструє, що загальна площа пояснює близько 45.3% варіації вартості квартир, тоді як решта 54.7% припадає на розташування (район/місто), поверх, клас забудови та стан ремонту.</w:t>
+        <w:t xml:space="preserve"> (MSE = 10.51). Таким чином, модель пояснює 61.19% варіативності продажів, а решта 38.81% припадає на інші маркетингові канали (радіо, пресу) та якість продукту.</w:t>
       </w:r>
     </w:p>
     <w:p>
@@ -1031,7 +1031,7 @@
           <w:sz w:val="28"/>
           <w:rFonts w:ascii="Times New Roman" w:hAnsi="Times New Roman" w:cs="Times New Roman" w:eastAsia="Times New Roman"/>
         </w:rPr>
-        <w:t>На цій лабораторній роботі я засвоїв методи побудови та діагностики моделей парної лінійної регресії і кореляційного аналізу в Python з використанням бібліотек pandas, scipy.stats, scikit-learn, matplotlib та seaborn. Я навчився оцінювати якість регресії за коефіцієнтом детермінації R², середньоквадратичною помилкою MSE/RMSE та проводити діагностику ключових передумов МНК (лінійності, гомоскедастичності та нормальності розподілу залишків). В ході роботи встановлено, що для біометричних даних анаконд лінійна модель має високий показник R² = 0.9243, проте залишки свідчать про перевагу алометричної степеневої залежності, а на ринку житла площа виступає ключовим, але не єдиним ціноутворюючим фактором (R² = 0.4527).</w:t>
+        <w:t>На цій лабораторній роботі я засвоїв методи побудови та діагностики моделей парної лінійної регресії і кореляційного аналізу в Python з використанням бібліотек pandas, scipy.stats, scikit-learn, matplotlib та seaborn. Я навчився оцінювати якість регресії за коефіцієнтом детермінації R², середньоквадратичною помилкою MSE/RMSE та проводити діагностику ключових передумов МНК (лінійності, гомоскедастичності та нормальності розподілу залишків). В ході роботи встановлено, що для біометричних даних анаконд лінійна модель має високий показник R² = 0.9243, проте залишки свідчать про перевагу алометричної степеневої залежності, а в аналізі маркетингових даних витрати на TV-рекламу виступають потужним драйвером продажів із високою прогнозною силою (r = 0.7822, R² = 0.6119).</w:t>
       </w:r>
     </w:p>
     <w:sectPr>

</xml_diff>